<commit_message>
feat: add document service and scaffold Flutter editor components with templates
</commit_message>
<xml_diff>
--- a/custom_templates/case/bao_cao_tong_hop_vu_an.docx
+++ b/custom_templates/case/bao_cao_tong_hop_vu_an.docx
@@ -72,7 +72,7 @@
           </mc:Choice>
           <mc:Fallback>
             <w:pict>
-              <v:line w14:anchorId="4F5BC3E7" id="Straight Connector 1" o:spid="_x0000_s1026" style="position:absolute;z-index:251659264;visibility:visible;mso-wrap-style:square;mso-wrap-distance-left:9pt;mso-wrap-distance-top:0;mso-wrap-distance-right:9pt;mso-wrap-distance-bottom:0;mso-position-horizontal:absolute;mso-position-horizontal-relative:text;mso-position-vertical:absolute;mso-position-vertical-relative:text" from="185.25pt,36.75pt" to="322.5pt,36.75pt" o:gfxdata="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" strokecolor="black [3040]"/>
+              <v:line w14:anchorId="7486E602" id="Straight Connector 1" o:spid="_x0000_s1026" style="position:absolute;z-index:251659264;visibility:visible;mso-wrap-style:square;mso-wrap-distance-left:9pt;mso-wrap-distance-top:0;mso-wrap-distance-right:9pt;mso-wrap-distance-bottom:0;mso-position-horizontal:absolute;mso-position-horizontal-relative:text;mso-position-vertical:absolute;mso-position-vertical-relative:text" from="185.25pt,36.75pt" to="322.5pt,36.75pt" o:gfxdata="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" strokecolor="black [3040]"/>
             </w:pict>
           </mc:Fallback>
         </mc:AlternateContent>
@@ -147,7 +147,27 @@
           <w:sz w:val="26"/>
           <w:szCs w:val="26"/>
         </w:rPr>
-        <w:t>{{ case. ten_day_du }}</w:t>
+        <w:t>{{</w:t>
+      </w:r>
+      <w:r>
+        <w:rPr>
+          <w:rFonts w:ascii="Times New Roman" w:hAnsi="Times New Roman" w:cs="Times New Roman"/>
+          <w:b/>
+          <w:bCs/>
+          <w:sz w:val="26"/>
+          <w:szCs w:val="26"/>
+        </w:rPr>
+        <w:t xml:space="preserve"> </w:t>
+      </w:r>
+      <w:r>
+        <w:rPr>
+          <w:rFonts w:ascii="Times New Roman" w:hAnsi="Times New Roman" w:cs="Times New Roman"/>
+          <w:b/>
+          <w:bCs/>
+          <w:sz w:val="26"/>
+          <w:szCs w:val="26"/>
+        </w:rPr>
+        <w:t>case.ten_day_du }}</w:t>
       </w:r>
     </w:p>
     <w:p>
@@ -160,37 +180,18 @@
         </w:rPr>
       </w:pPr>
       <w:r>
+        <w:t>{%p for p in case.con_nguoi_list %}</w:t>
+      </w:r>
+    </w:p>
+    <w:p>
+      <w:pPr>
+        <w:spacing w:line="360" w:lineRule="exact"/>
         <w:rPr>
           <w:rFonts w:ascii="Times New Roman" w:hAnsi="Times New Roman" w:cs="Times New Roman"/>
           <w:sz w:val="26"/>
           <w:szCs w:val="26"/>
         </w:rPr>
-        <w:t xml:space="preserve">{% for p in </w:t>
-      </w:r>
-      <w:r>
-        <w:rPr>
-          <w:rFonts w:ascii="Times New Roman" w:hAnsi="Times New Roman" w:cs="Times New Roman"/>
-          <w:sz w:val="26"/>
-          <w:szCs w:val="26"/>
-        </w:rPr>
-        <w:t>con_nguoi_list</w:t>
-      </w:r>
-      <w:r>
-        <w:rPr>
-          <w:rFonts w:ascii="Times New Roman" w:hAnsi="Times New Roman" w:cs="Times New Roman"/>
-          <w:sz w:val="26"/>
-          <w:szCs w:val="26"/>
-        </w:rPr>
-        <w:t xml:space="preserve"> %}</w:t>
-      </w:r>
-      <w:r>
-        <w:rPr>
-          <w:rFonts w:ascii="Times New Roman" w:hAnsi="Times New Roman" w:cs="Times New Roman"/>
-          <w:sz w:val="26"/>
-          <w:szCs w:val="26"/>
-        </w:rPr>
-        <w:br/>
-      </w:r>
+      </w:pPr>
       <w:r>
         <w:rPr>
           <w:rFonts w:ascii="Times New Roman" w:hAnsi="Times New Roman" w:cs="Times New Roman"/>
@@ -223,50 +224,90 @@
         </w:rPr>
         <w:t xml:space="preserve"> Họ và tên: {{ p.ho_ten }} (Sinh ngày: {{ p.ngay_sinh }} - Số CCCD: {{ p.cccd }})</w:t>
       </w:r>
+    </w:p>
+    <w:p>
+      <w:pPr>
+        <w:spacing w:line="360" w:lineRule="exact"/>
+        <w:rPr>
+          <w:rFonts w:ascii="Times New Roman" w:hAnsi="Times New Roman" w:cs="Times New Roman"/>
+          <w:sz w:val="26"/>
+          <w:szCs w:val="26"/>
+        </w:rPr>
+      </w:pPr>
       <w:r>
         <w:rPr>
           <w:rFonts w:ascii="Times New Roman" w:hAnsi="Times New Roman" w:cs="Times New Roman"/>
           <w:sz w:val="26"/>
           <w:szCs w:val="26"/>
         </w:rPr>
-        <w:br/>
-        <w:t xml:space="preserve">  + Quê quán: {{ p.que_quan }}</w:t>
+        <w:t>+ Quê quán: {{ p.que_quan }}</w:t>
       </w:r>
+    </w:p>
+    <w:p>
+      <w:pPr>
+        <w:spacing w:line="360" w:lineRule="exact"/>
+        <w:rPr>
+          <w:rFonts w:ascii="Times New Roman" w:hAnsi="Times New Roman" w:cs="Times New Roman"/>
+          <w:sz w:val="26"/>
+          <w:szCs w:val="26"/>
+        </w:rPr>
+      </w:pPr>
       <w:r>
         <w:rPr>
           <w:rFonts w:ascii="Times New Roman" w:hAnsi="Times New Roman" w:cs="Times New Roman"/>
           <w:sz w:val="26"/>
           <w:szCs w:val="26"/>
         </w:rPr>
-        <w:br/>
-        <w:t xml:space="preserve">  + Thường trú: {{ p.noi_thuong_tru }}</w:t>
+        <w:t>+ Thường trú: {{ p.noi_thuong_tru }}</w:t>
       </w:r>
+    </w:p>
+    <w:p>
+      <w:pPr>
+        <w:spacing w:line="360" w:lineRule="exact"/>
+        <w:rPr>
+          <w:rFonts w:ascii="Times New Roman" w:hAnsi="Times New Roman" w:cs="Times New Roman"/>
+          <w:sz w:val="26"/>
+          <w:szCs w:val="26"/>
+        </w:rPr>
+      </w:pPr>
       <w:r>
         <w:rPr>
           <w:rFonts w:ascii="Times New Roman" w:hAnsi="Times New Roman" w:cs="Times New Roman"/>
           <w:sz w:val="26"/>
           <w:szCs w:val="26"/>
         </w:rPr>
-        <w:br/>
-        <w:t xml:space="preserve">  + Nơi ở hiện nay: {{ p.noi_o_hien_tai }}</w:t>
+        <w:t>+ Nơi ở hiện nay: {{ p.noi_o_hien_tai }}</w:t>
       </w:r>
+    </w:p>
+    <w:p>
+      <w:pPr>
+        <w:spacing w:line="360" w:lineRule="exact"/>
+        <w:rPr>
+          <w:rFonts w:ascii="Times New Roman" w:hAnsi="Times New Roman" w:cs="Times New Roman"/>
+          <w:sz w:val="26"/>
+          <w:szCs w:val="26"/>
+        </w:rPr>
+      </w:pPr>
       <w:r>
         <w:rPr>
           <w:rFonts w:ascii="Times New Roman" w:hAnsi="Times New Roman" w:cs="Times New Roman"/>
           <w:sz w:val="26"/>
           <w:szCs w:val="26"/>
         </w:rPr>
-        <w:br/>
-        <w:t xml:space="preserve">  + Nghề nghiệp: {{ p.nghe_nghiep }}</w:t>
+        <w:t>+ Nghề nghiệp: {{ p.nghe_nghiep }}</w:t>
       </w:r>
-      <w:r>
+    </w:p>
+    <w:p>
+      <w:pPr>
+        <w:spacing w:line="360" w:lineRule="exact"/>
         <w:rPr>
           <w:rFonts w:ascii="Times New Roman" w:hAnsi="Times New Roman" w:cs="Times New Roman"/>
           <w:sz w:val="26"/>
           <w:szCs w:val="26"/>
         </w:rPr>
-        <w:br/>
-        <w:t>{% endfor %}</w:t>
+      </w:pPr>
+      <w:r>
+        <w:t>{%p endfor %}</w:t>
       </w:r>
     </w:p>
     <w:sectPr>

</xml_diff>